<commit_message>
Use Streamlit secrets in streamlit_app + WCAG Assistant
</commit_message>
<xml_diff>
--- a/out/castellhealth.com__home/report.docx
+++ b/out/castellhealth.com__home/report.docx
@@ -17,7 +17,7 @@
     </w:p>
     <w:p>
       <w:r>
-        <w:t>Methodology: axe-core baseline + semantic review (RAG).</w:t>
+        <w:t>Methodology: axe-core baseline, keyboard probe, and semantic review (RAG).</w:t>
       </w:r>
     </w:p>
     <w:p>
@@ -30,39 +30,106 @@
     </w:p>
     <w:tbl>
       <w:tblPr>
+        <w:tblStyle w:val="LightList"/>
         <w:tblW w:type="auto" w:w="0"/>
         <w:tblLook w:firstColumn="1" w:firstRow="1" w:lastColumn="0" w:lastRow="0" w:noHBand="0" w:noVBand="1" w:val="04A0"/>
       </w:tblPr>
       <w:tblGrid>
-        <w:gridCol w:w="2160"/>
-        <w:gridCol w:w="2160"/>
-        <w:gridCol w:w="2160"/>
-        <w:gridCol w:w="2160"/>
+        <w:gridCol w:w="4320"/>
+        <w:gridCol w:w="4320"/>
       </w:tblGrid>
       <w:tr>
         <w:tc>
           <w:tcPr>
-            <w:tcW w:type="dxa" w:w="2160"/>
+            <w:tcW w:type="dxa" w:w="4320"/>
           </w:tcPr>
           <w:p>
             <w:r>
-              <w:t>Bucket</w:t>
+              <w:t>Metric</w:t>
             </w:r>
           </w:p>
         </w:tc>
         <w:tc>
           <w:tcPr>
-            <w:tcW w:type="dxa" w:w="2160"/>
+            <w:tcW w:type="dxa" w:w="4320"/>
           </w:tcPr>
           <w:p>
             <w:r>
-              <w:t>Count</w:t>
+              <w:t>Value</w:t>
+            </w:r>
+          </w:p>
+        </w:tc>
+      </w:tr>
+      <w:tr>
+        <w:tc>
+          <w:tcPr>
+            <w:tcW w:type="dxa" w:w="4320"/>
+          </w:tcPr>
+          <w:p>
+            <w:r>
+              <w:t>axe: Violations</w:t>
             </w:r>
           </w:p>
         </w:tc>
         <w:tc>
           <w:tcPr>
-            <w:tcW w:type="dxa" w:w="2160"/>
+            <w:tcW w:type="dxa" w:w="4320"/>
+          </w:tcPr>
+          <w:p>
+            <w:r>
+              <w:t>2</w:t>
+            </w:r>
+          </w:p>
+        </w:tc>
+      </w:tr>
+      <w:tr>
+        <w:tc>
+          <w:tcPr>
+            <w:tcW w:type="dxa" w:w="4320"/>
+          </w:tcPr>
+          <w:p>
+            <w:r>
+              <w:t>axe: Incomplete</w:t>
+            </w:r>
+          </w:p>
+        </w:tc>
+        <w:tc>
+          <w:tcPr>
+            <w:tcW w:type="dxa" w:w="4320"/>
+          </w:tcPr>
+          <w:p>
+            <w:r>
+              <w:t>3</w:t>
+            </w:r>
+          </w:p>
+        </w:tc>
+      </w:tr>
+      <w:tr>
+        <w:tc>
+          <w:tcPr>
+            <w:tcW w:type="dxa" w:w="4320"/>
+          </w:tcPr>
+          <w:p>
+            <w:r>
+              <w:t>axe: Passes</w:t>
+            </w:r>
+          </w:p>
+        </w:tc>
+        <w:tc>
+          <w:tcPr>
+            <w:tcW w:type="dxa" w:w="4320"/>
+          </w:tcPr>
+          <w:p>
+            <w:r>
+              <w:t>24</w:t>
+            </w:r>
+          </w:p>
+        </w:tc>
+      </w:tr>
+      <w:tr>
+        <w:tc>
+          <w:tcPr>
+            <w:tcW w:type="dxa" w:w="4320"/>
           </w:tcPr>
           <w:p>
             <w:r>
@@ -72,11 +139,11 @@
         </w:tc>
         <w:tc>
           <w:tcPr>
-            <w:tcW w:type="dxa" w:w="2160"/>
+            <w:tcW w:type="dxa" w:w="4320"/>
           </w:tcPr>
           <w:p>
             <w:r>
-              <w:t>AI Verdicts</w:t>
+              <w:t>30</w:t>
             </w:r>
           </w:p>
         </w:tc>
@@ -84,159 +151,7 @@
       <w:tr>
         <w:tc>
           <w:tcPr>
-            <w:tcW w:type="dxa" w:w="2160"/>
-          </w:tcPr>
-          <w:p>
-            <w:r>
-              <w:t>Violations</w:t>
-            </w:r>
-          </w:p>
-        </w:tc>
-        <w:tc>
-          <w:tcPr>
-            <w:tcW w:type="dxa" w:w="2160"/>
-          </w:tcPr>
-          <w:p>
-            <w:r>
-              <w:t>2</w:t>
-            </w:r>
-          </w:p>
-        </w:tc>
-        <w:tc>
-          <w:tcPr>
-            <w:tcW w:type="dxa" w:w="2160"/>
-          </w:tcPr>
-          <w:p>
-            <w:r/>
-          </w:p>
-        </w:tc>
-        <w:tc>
-          <w:tcPr>
-            <w:tcW w:type="dxa" w:w="2160"/>
-          </w:tcPr>
-          <w:p>
-            <w:r/>
-          </w:p>
-        </w:tc>
-      </w:tr>
-      <w:tr>
-        <w:tc>
-          <w:tcPr>
-            <w:tcW w:type="dxa" w:w="2160"/>
-          </w:tcPr>
-          <w:p>
-            <w:r>
-              <w:t>Incomplete</w:t>
-            </w:r>
-          </w:p>
-        </w:tc>
-        <w:tc>
-          <w:tcPr>
-            <w:tcW w:type="dxa" w:w="2160"/>
-          </w:tcPr>
-          <w:p>
-            <w:r>
-              <w:t>3</w:t>
-            </w:r>
-          </w:p>
-        </w:tc>
-        <w:tc>
-          <w:tcPr>
-            <w:tcW w:type="dxa" w:w="2160"/>
-          </w:tcPr>
-          <w:p>
-            <w:r/>
-          </w:p>
-        </w:tc>
-        <w:tc>
-          <w:tcPr>
-            <w:tcW w:type="dxa" w:w="2160"/>
-          </w:tcPr>
-          <w:p>
-            <w:r/>
-          </w:p>
-        </w:tc>
-      </w:tr>
-      <w:tr>
-        <w:tc>
-          <w:tcPr>
-            <w:tcW w:type="dxa" w:w="2160"/>
-          </w:tcPr>
-          <w:p>
-            <w:r>
-              <w:t>Passes</w:t>
-            </w:r>
-          </w:p>
-        </w:tc>
-        <w:tc>
-          <w:tcPr>
-            <w:tcW w:type="dxa" w:w="2160"/>
-          </w:tcPr>
-          <w:p>
-            <w:r>
-              <w:t>39</w:t>
-            </w:r>
-          </w:p>
-        </w:tc>
-        <w:tc>
-          <w:tcPr>
-            <w:tcW w:type="dxa" w:w="2160"/>
-          </w:tcPr>
-          <w:p>
-            <w:r/>
-          </w:p>
-        </w:tc>
-        <w:tc>
-          <w:tcPr>
-            <w:tcW w:type="dxa" w:w="2160"/>
-          </w:tcPr>
-          <w:p>
-            <w:r/>
-          </w:p>
-        </w:tc>
-      </w:tr>
-      <w:tr>
-        <w:tc>
-          <w:tcPr>
-            <w:tcW w:type="dxa" w:w="2160"/>
-          </w:tcPr>
-          <w:p>
-            <w:r>
-              <w:t>AI Candidates</w:t>
-            </w:r>
-          </w:p>
-        </w:tc>
-        <w:tc>
-          <w:tcPr>
-            <w:tcW w:type="dxa" w:w="2160"/>
-          </w:tcPr>
-          <w:p>
-            <w:r>
-              <w:t>12</w:t>
-            </w:r>
-          </w:p>
-        </w:tc>
-        <w:tc>
-          <w:tcPr>
-            <w:tcW w:type="dxa" w:w="2160"/>
-          </w:tcPr>
-          <w:p>
-            <w:r/>
-          </w:p>
-        </w:tc>
-        <w:tc>
-          <w:tcPr>
-            <w:tcW w:type="dxa" w:w="2160"/>
-          </w:tcPr>
-          <w:p>
-            <w:r/>
-          </w:p>
-        </w:tc>
-      </w:tr>
-      <w:tr>
-        <w:tc>
-          <w:tcPr>
-            <w:tcW w:type="dxa" w:w="2160"/>
+            <w:tcW w:type="dxa" w:w="4320"/>
           </w:tcPr>
           <w:p>
             <w:r>
@@ -246,28 +161,185 @@
         </w:tc>
         <w:tc>
           <w:tcPr>
-            <w:tcW w:type="dxa" w:w="2160"/>
+            <w:tcW w:type="dxa" w:w="4320"/>
           </w:tcPr>
           <w:p>
             <w:r>
-              <w:t>12</w:t>
+              <w:t>30</w:t>
+            </w:r>
+          </w:p>
+        </w:tc>
+      </w:tr>
+      <w:tr>
+        <w:tc>
+          <w:tcPr>
+            <w:tcW w:type="dxa" w:w="4320"/>
+          </w:tcPr>
+          <w:p>
+            <w:r>
+              <w:t>AI 2.4.6 items</w:t>
             </w:r>
           </w:p>
         </w:tc>
         <w:tc>
           <w:tcPr>
-            <w:tcW w:type="dxa" w:w="2160"/>
+            <w:tcW w:type="dxa" w:w="4320"/>
           </w:tcPr>
           <w:p>
-            <w:r/>
+            <w:r>
+              <w:t>0</w:t>
+            </w:r>
+          </w:p>
+        </w:tc>
+      </w:tr>
+    </w:tbl>
+    <w:p>
+      <w:pPr>
+        <w:pStyle w:val="Heading2"/>
+      </w:pPr>
+      <w:r>
+        <w:t>Keyboard Probe — Summary</w:t>
+      </w:r>
+    </w:p>
+    <w:tbl>
+      <w:tblPr>
+        <w:tblStyle w:val="LightList"/>
+        <w:tblW w:type="auto" w:w="0"/>
+        <w:tblLook w:firstColumn="1" w:firstRow="1" w:lastColumn="0" w:lastRow="0" w:noHBand="0" w:noVBand="1" w:val="04A0"/>
+      </w:tblPr>
+      <w:tblGrid>
+        <w:gridCol w:w="4320"/>
+        <w:gridCol w:w="4320"/>
+      </w:tblGrid>
+      <w:tr>
+        <w:tc>
+          <w:tcPr>
+            <w:tcW w:type="dxa" w:w="4320"/>
+          </w:tcPr>
+          <w:p>
+            <w:r>
+              <w:t>Metric</w:t>
+            </w:r>
           </w:p>
         </w:tc>
         <w:tc>
           <w:tcPr>
-            <w:tcW w:type="dxa" w:w="2160"/>
+            <w:tcW w:type="dxa" w:w="4320"/>
           </w:tcPr>
           <w:p>
-            <w:r/>
+            <w:r>
+              <w:t>Value</w:t>
+            </w:r>
+          </w:p>
+        </w:tc>
+      </w:tr>
+      <w:tr>
+        <w:tc>
+          <w:tcPr>
+            <w:tcW w:type="dxa" w:w="4320"/>
+          </w:tcPr>
+          <w:p>
+            <w:r>
+              <w:t>activation_checks</w:t>
+            </w:r>
+          </w:p>
+        </w:tc>
+        <w:tc>
+          <w:tcPr>
+            <w:tcW w:type="dxa" w:w="4320"/>
+          </w:tcPr>
+          <w:p>
+            <w:r>
+              <w:t>9</w:t>
+            </w:r>
+          </w:p>
+        </w:tc>
+      </w:tr>
+      <w:tr>
+        <w:tc>
+          <w:tcPr>
+            <w:tcW w:type="dxa" w:w="4320"/>
+          </w:tcPr>
+          <w:p>
+            <w:r>
+              <w:t>tab_stops</w:t>
+            </w:r>
+          </w:p>
+        </w:tc>
+        <w:tc>
+          <w:tcPr>
+            <w:tcW w:type="dxa" w:w="4320"/>
+          </w:tcPr>
+          <w:p>
+            <w:r>
+              <w:t>2</w:t>
+            </w:r>
+          </w:p>
+        </w:tc>
+      </w:tr>
+      <w:tr>
+        <w:tc>
+          <w:tcPr>
+            <w:tcW w:type="dxa" w:w="4320"/>
+          </w:tcPr>
+          <w:p>
+            <w:r>
+              <w:t>trace_steps</w:t>
+            </w:r>
+          </w:p>
+        </w:tc>
+        <w:tc>
+          <w:tcPr>
+            <w:tcW w:type="dxa" w:w="4320"/>
+          </w:tcPr>
+          <w:p>
+            <w:r>
+              <w:t>10</w:t>
+            </w:r>
+          </w:p>
+        </w:tc>
+      </w:tr>
+      <w:tr>
+        <w:tc>
+          <w:tcPr>
+            <w:tcW w:type="dxa" w:w="4320"/>
+          </w:tcPr>
+          <w:p>
+            <w:r>
+              <w:t>trap_suspected</w:t>
+            </w:r>
+          </w:p>
+        </w:tc>
+        <w:tc>
+          <w:tcPr>
+            <w:tcW w:type="dxa" w:w="4320"/>
+          </w:tcPr>
+          <w:p>
+            <w:r>
+              <w:t>False</w:t>
+            </w:r>
+          </w:p>
+        </w:tc>
+      </w:tr>
+      <w:tr>
+        <w:tc>
+          <w:tcPr>
+            <w:tcW w:type="dxa" w:w="4320"/>
+          </w:tcPr>
+          <w:p>
+            <w:r>
+              <w:t>unreachable</w:t>
+            </w:r>
+          </w:p>
+        </w:tc>
+        <w:tc>
+          <w:tcPr>
+            <w:tcW w:type="dxa" w:w="4320"/>
+          </w:tcPr>
+          <w:p>
+            <w:r>
+              <w:t>2</w:t>
+            </w:r>
           </w:p>
         </w:tc>
       </w:tr>
@@ -285,87 +357,7 @@
         <w:pStyle w:val="Heading2"/>
       </w:pPr>
       <w:r>
-        <w:t>1. BEST_PRACTICE — landmark-unique</w:t>
-      </w:r>
-    </w:p>
-    <w:p>
-      <w:r>
-        <w:t>Selector: .uk-navbar</w:t>
-      </w:r>
-    </w:p>
-    <w:p>
-      <w:r>
-        <w:t>Verdict: needs-change (confidence 0.9)</w:t>
-      </w:r>
-    </w:p>
-    <w:p>
-      <w:r>
-        <w:t>Reason: The nav element lacks a unique aria-label, aria-labelledby, or title, making it indistinguishable from other landmarks, violating axe:landmark-unique.</w:t>
-      </w:r>
-    </w:p>
-    <w:p>
-      <w:r>
-        <w:t>Ref: https://dequeuniversity.com/rules/axe/4.7/landmark-unique?application=axeAPI</w:t>
-      </w:r>
-    </w:p>
-    <w:p>
-      <w:r>
-        <w:t>Screenshot:</w:t>
-      </w:r>
-    </w:p>
-    <w:p>
-      <w:r>
-        <w:drawing>
-          <wp:inline xmlns:a="http://schemas.openxmlformats.org/drawingml/2006/main" xmlns:pic="http://schemas.openxmlformats.org/drawingml/2006/picture">
-            <wp:extent cx="3291840" cy="292266"/>
-            <wp:docPr id="1" name="Picture 1"/>
-            <wp:cNvGraphicFramePr>
-              <a:graphicFrameLocks noChangeAspect="1"/>
-            </wp:cNvGraphicFramePr>
-            <a:graphic>
-              <a:graphicData uri="http://schemas.openxmlformats.org/drawingml/2006/picture">
-                <pic:pic>
-                  <pic:nvPicPr>
-                    <pic:cNvPr id="0" name="landmark-unique__.uk-navbar.png"/>
-                    <pic:cNvPicPr/>
-                  </pic:nvPicPr>
-                  <pic:blipFill>
-                    <a:blip r:embed="rId9"/>
-                    <a:stretch>
-                      <a:fillRect/>
-                    </a:stretch>
-                  </pic:blipFill>
-                  <pic:spPr>
-                    <a:xfrm>
-                      <a:off x="0" y="0"/>
-                      <a:ext cx="3291840" cy="292266"/>
-                    </a:xfrm>
-                    <a:prstGeom prst="rect"/>
-                  </pic:spPr>
-                </pic:pic>
-              </a:graphicData>
-            </a:graphic>
-          </wp:inline>
-        </w:drawing>
-      </w:r>
-    </w:p>
-    <w:p>
-      <w:hyperlink r:id="rId10">
-        <w:r>
-          <w:rPr>
-            <w:color w:val="1155CC"/>
-            <w:u w:val="single"/>
-          </w:rPr>
-          <w:t>Open full-size image</w:t>
-        </w:r>
-      </w:hyperlink>
-    </w:p>
-    <w:p>
-      <w:pPr>
-        <w:pStyle w:val="Heading2"/>
-      </w:pPr>
-      <w:r>
-        <w:t>2. SC-4.1.2 — link-name</w:t>
+        <w:t>1. SC-2.4.4 — link-name</w:t>
       </w:r>
     </w:p>
     <w:p>
@@ -380,72 +372,25 @@
     </w:p>
     <w:p>
       <w:r>
-        <w:t>Reason: The link lacks discernible text for screen readers, as indicated by the empty accessible name and the axe diagnostics stating it has no visible text.</w:t>
+        <w:t>Reason: The link lacks discernible text for screen readers, as indicated by the axe diagnostics stating it has no accessible name.</w:t>
       </w:r>
     </w:p>
     <w:p>
       <w:r>
-        <w:t>Ref: https://dequeuniversity.com/rules/axe/4.7/link-name?application=axeAPI</w:t>
+        <w:t>Ref: https://dequeuniversity.com/rules/axe/4.10/link-name?application=axeAPI</w:t>
       </w:r>
     </w:p>
     <w:p>
       <w:r>
-        <w:t>Screenshot:</w:t>
+        <w:t>(No screenshot available)</w:t>
       </w:r>
-    </w:p>
-    <w:p>
-      <w:r>
-        <w:drawing>
-          <wp:inline xmlns:a="http://schemas.openxmlformats.org/drawingml/2006/main" xmlns:pic="http://schemas.openxmlformats.org/drawingml/2006/picture">
-            <wp:extent cx="3291840" cy="2282073"/>
-            <wp:docPr id="2" name="Picture 2"/>
-            <wp:cNvGraphicFramePr>
-              <a:graphicFrameLocks noChangeAspect="1"/>
-            </wp:cNvGraphicFramePr>
-            <a:graphic>
-              <a:graphicData uri="http://schemas.openxmlformats.org/drawingml/2006/picture">
-                <pic:pic>
-                  <pic:nvPicPr>
-                    <pic:cNvPr id="0" name="link-name__.uk-navbar-item.png"/>
-                    <pic:cNvPicPr/>
-                  </pic:nvPicPr>
-                  <pic:blipFill>
-                    <a:blip r:embed="rId11"/>
-                    <a:stretch>
-                      <a:fillRect/>
-                    </a:stretch>
-                  </pic:blipFill>
-                  <pic:spPr>
-                    <a:xfrm>
-                      <a:off x="0" y="0"/>
-                      <a:ext cx="3291840" cy="2282073"/>
-                    </a:xfrm>
-                    <a:prstGeom prst="rect"/>
-                  </pic:spPr>
-                </pic:pic>
-              </a:graphicData>
-            </a:graphic>
-          </wp:inline>
-        </w:drawing>
-      </w:r>
-    </w:p>
-    <w:p>
-      <w:hyperlink r:id="rId12">
-        <w:r>
-          <w:rPr>
-            <w:color w:val="1155CC"/>
-            <w:u w:val="single"/>
-          </w:rPr>
-          <w:t>Open full-size image</w:t>
-        </w:r>
-      </w:hyperlink>
     </w:p>
     <w:p>
       <w:pPr>
         <w:pStyle w:val="Heading2"/>
       </w:pPr>
       <w:r>
-        <w:t>3. SC-4.1.2 — link-name</w:t>
+        <w:t>2. SC-2.4.4 — link-name</w:t>
       </w:r>
     </w:p>
     <w:p>
@@ -460,72 +405,25 @@
     </w:p>
     <w:p>
       <w:r>
-        <w:t>Reason: The link lacks discernible text for screen readers, as the accessible name is empty. This violates SC 4.1.2 regarding accessible names for links.</w:t>
+        <w:t>Reason: The link lacks discernible text for screen readers, as it only contains an image with an empty alt attribute, failing to communicate its purpose (axe:link-name).</w:t>
       </w:r>
     </w:p>
     <w:p>
       <w:r>
-        <w:t>Ref: https://dequeuniversity.com/rules/axe/4.7/link-name?application=axeAPI</w:t>
+        <w:t>Ref: https://dequeuniversity.com/rules/axe/4.10/link-name?application=axeAPI</w:t>
       </w:r>
     </w:p>
     <w:p>
       <w:r>
-        <w:t>Screenshot:</w:t>
+        <w:t>(No screenshot available)</w:t>
       </w:r>
-    </w:p>
-    <w:p>
-      <w:r>
-        <w:drawing>
-          <wp:inline xmlns:a="http://schemas.openxmlformats.org/drawingml/2006/main" xmlns:pic="http://schemas.openxmlformats.org/drawingml/2006/picture">
-            <wp:extent cx="3291840" cy="529457"/>
-            <wp:docPr id="3" name="Picture 3"/>
-            <wp:cNvGraphicFramePr>
-              <a:graphicFrameLocks noChangeAspect="1"/>
-            </wp:cNvGraphicFramePr>
-            <a:graphic>
-              <a:graphicData uri="http://schemas.openxmlformats.org/drawingml/2006/picture">
-                <pic:pic>
-                  <pic:nvPicPr>
-                    <pic:cNvPr id="0" name="link-name__a_href_scrolltome_.png"/>
-                    <pic:cNvPicPr/>
-                  </pic:nvPicPr>
-                  <pic:blipFill>
-                    <a:blip r:embed="rId13"/>
-                    <a:stretch>
-                      <a:fillRect/>
-                    </a:stretch>
-                  </pic:blipFill>
-                  <pic:spPr>
-                    <a:xfrm>
-                      <a:off x="0" y="0"/>
-                      <a:ext cx="3291840" cy="529457"/>
-                    </a:xfrm>
-                    <a:prstGeom prst="rect"/>
-                  </pic:spPr>
-                </pic:pic>
-              </a:graphicData>
-            </a:graphic>
-          </wp:inline>
-        </w:drawing>
-      </w:r>
-    </w:p>
-    <w:p>
-      <w:hyperlink r:id="rId14">
-        <w:r>
-          <w:rPr>
-            <w:color w:val="1155CC"/>
-            <w:u w:val="single"/>
-          </w:rPr>
-          <w:t>Open full-size image</w:t>
-        </w:r>
-      </w:hyperlink>
     </w:p>
     <w:p>
       <w:pPr>
         <w:pStyle w:val="Heading2"/>
       </w:pPr>
       <w:r>
-        <w:t>4. SC-4.1.2 — link-name</w:t>
+        <w:t>3. SC-2.4.4 — link-name</w:t>
       </w:r>
     </w:p>
     <w:p>
@@ -540,72 +438,25 @@
     </w:p>
     <w:p>
       <w:r>
-        <w:t>Reason: The link lacks discernible text for screen readers, as indicated by the empty accessible name and AXE diagnostics stating it has no visible text.</w:t>
+        <w:t>Reason: The link lacks discernible text for screen readers, as indicated by the absence of visible text and aria-label, violating SC 2.4.4.</w:t>
       </w:r>
     </w:p>
     <w:p>
       <w:r>
-        <w:t>Ref: https://dequeuniversity.com/rules/axe/4.7/link-name?application=axeAPI</w:t>
+        <w:t>Ref: https://dequeuniversity.com/rules/axe/4.10/link-name?application=axeAPI</w:t>
       </w:r>
     </w:p>
     <w:p>
       <w:r>
-        <w:t>Screenshot:</w:t>
+        <w:t>(No screenshot available)</w:t>
       </w:r>
-    </w:p>
-    <w:p>
-      <w:r>
-        <w:drawing>
-          <wp:inline xmlns:a="http://schemas.openxmlformats.org/drawingml/2006/main" xmlns:pic="http://schemas.openxmlformats.org/drawingml/2006/picture">
-            <wp:extent cx="3291840" cy="3291840"/>
-            <wp:docPr id="4" name="Picture 4"/>
-            <wp:cNvGraphicFramePr>
-              <a:graphicFrameLocks noChangeAspect="1"/>
-            </wp:cNvGraphicFramePr>
-            <a:graphic>
-              <a:graphicData uri="http://schemas.openxmlformats.org/drawingml/2006/picture">
-                <pic:pic>
-                  <pic:nvPicPr>
-                    <pic:cNvPr id="0" name="link-name__a_target__social_nth-child_1_.png"/>
-                    <pic:cNvPicPr/>
-                  </pic:nvPicPr>
-                  <pic:blipFill>
-                    <a:blip r:embed="rId15"/>
-                    <a:stretch>
-                      <a:fillRect/>
-                    </a:stretch>
-                  </pic:blipFill>
-                  <pic:spPr>
-                    <a:xfrm>
-                      <a:off x="0" y="0"/>
-                      <a:ext cx="3291840" cy="3291840"/>
-                    </a:xfrm>
-                    <a:prstGeom prst="rect"/>
-                  </pic:spPr>
-                </pic:pic>
-              </a:graphicData>
-            </a:graphic>
-          </wp:inline>
-        </w:drawing>
-      </w:r>
-    </w:p>
-    <w:p>
-      <w:hyperlink r:id="rId16">
-        <w:r>
-          <w:rPr>
-            <w:color w:val="1155CC"/>
-            <w:u w:val="single"/>
-          </w:rPr>
-          <w:t>Open full-size image</w:t>
-        </w:r>
-      </w:hyperlink>
     </w:p>
     <w:p>
       <w:pPr>
         <w:pStyle w:val="Heading2"/>
       </w:pPr>
       <w:r>
-        <w:t>5. SC-4.1.2 — link-name</w:t>
+        <w:t>4. SC-2.4.4 — link-name</w:t>
       </w:r>
     </w:p>
     <w:p>
@@ -620,72 +471,91 @@
     </w:p>
     <w:p>
       <w:r>
-        <w:t>Reason: The link lacks discernible text for screen readers, as indicated by the empty accessible name and AXE diagnostics stating it has no visible text.</w:t>
+        <w:t>Reason: The link lacks discernible text for screen readers, as it has no visible name or aria-label, violating SC 2.4.4.</w:t>
       </w:r>
     </w:p>
     <w:p>
       <w:r>
-        <w:t>Ref: https://dequeuniversity.com/rules/axe/4.7/link-name?application=axeAPI</w:t>
+        <w:t>Ref: https://dequeuniversity.com/rules/axe/4.10/link-name?application=axeAPI</w:t>
       </w:r>
     </w:p>
     <w:p>
       <w:r>
-        <w:t>Screenshot:</w:t>
+        <w:t>(No screenshot available)</w:t>
       </w:r>
-    </w:p>
-    <w:p>
-      <w:r>
-        <w:drawing>
-          <wp:inline xmlns:a="http://schemas.openxmlformats.org/drawingml/2006/main" xmlns:pic="http://schemas.openxmlformats.org/drawingml/2006/picture">
-            <wp:extent cx="3291840" cy="3291840"/>
-            <wp:docPr id="5" name="Picture 5"/>
-            <wp:cNvGraphicFramePr>
-              <a:graphicFrameLocks noChangeAspect="1"/>
-            </wp:cNvGraphicFramePr>
-            <a:graphic>
-              <a:graphicData uri="http://schemas.openxmlformats.org/drawingml/2006/picture">
-                <pic:pic>
-                  <pic:nvPicPr>
-                    <pic:cNvPr id="0" name="link-name__a_target__social_nth-child_2_.png"/>
-                    <pic:cNvPicPr/>
-                  </pic:nvPicPr>
-                  <pic:blipFill>
-                    <a:blip r:embed="rId17"/>
-                    <a:stretch>
-                      <a:fillRect/>
-                    </a:stretch>
-                  </pic:blipFill>
-                  <pic:spPr>
-                    <a:xfrm>
-                      <a:off x="0" y="0"/>
-                      <a:ext cx="3291840" cy="3291840"/>
-                    </a:xfrm>
-                    <a:prstGeom prst="rect"/>
-                  </pic:spPr>
-                </pic:pic>
-              </a:graphicData>
-            </a:graphic>
-          </wp:inline>
-        </w:drawing>
-      </w:r>
-    </w:p>
-    <w:p>
-      <w:hyperlink r:id="rId18">
-        <w:r>
-          <w:rPr>
-            <w:color w:val="1155CC"/>
-            <w:u w:val="single"/>
-          </w:rPr>
-          <w:t>Open full-size image</w:t>
-        </w:r>
-      </w:hyperlink>
     </w:p>
     <w:p>
       <w:pPr>
         <w:pStyle w:val="Heading2"/>
       </w:pPr>
       <w:r>
-        <w:t>6. SC-1.3.1 — aria-required-children</w:t>
+        <w:t>5. SC-2.5.8 — target-size</w:t>
+      </w:r>
+    </w:p>
+    <w:p>
+      <w:r>
+        <w:t>Selector: #post-750 &gt; .text &gt; .post__link &gt; a</w:t>
+      </w:r>
+    </w:p>
+    <w:p>
+      <w:r>
+        <w:t>Verdict: needs-change (confidence 0.9)</w:t>
+      </w:r>
+    </w:p>
+    <w:p>
+      <w:r>
+        <w:t>Reason: The touch target is 21px tall, which is below the required 24px size, violating SC 2.5.8. Additionally, there is insufficient space around the target.</w:t>
+      </w:r>
+    </w:p>
+    <w:p>
+      <w:r>
+        <w:t>Ref: https://dequeuniversity.com/rules/axe/4.10/target-size?application=axeAPI</w:t>
+      </w:r>
+    </w:p>
+    <w:p>
+      <w:r>
+        <w:t>(No screenshot available)</w:t>
+      </w:r>
+    </w:p>
+    <w:p>
+      <w:pPr>
+        <w:pStyle w:val="Heading2"/>
+      </w:pPr>
+      <w:r>
+        <w:t>6. SC-2.5.8 — target-size</w:t>
+      </w:r>
+    </w:p>
+    <w:p>
+      <w:r>
+        <w:t>Selector: #post-592 &gt; .text &gt; .post__link &gt; a</w:t>
+      </w:r>
+    </w:p>
+    <w:p>
+      <w:r>
+        <w:t>Verdict: needs-change (confidence 0.9)</w:t>
+      </w:r>
+    </w:p>
+    <w:p>
+      <w:r>
+        <w:t>Reason: The touch target is 21px in height, which is below the required 24px, violating SC 2.5.8 for target size.</w:t>
+      </w:r>
+    </w:p>
+    <w:p>
+      <w:r>
+        <w:t>Ref: https://dequeuniversity.com/rules/axe/4.10/target-size?application=axeAPI</w:t>
+      </w:r>
+    </w:p>
+    <w:p>
+      <w:r>
+        <w:t>(No screenshot available)</w:t>
+      </w:r>
+    </w:p>
+    <w:p>
+      <w:pPr>
+        <w:pStyle w:val="Heading2"/>
+      </w:pPr>
+      <w:r>
+        <w:t>7. SC-1.3.1 — aria-required-children</w:t>
       </w:r>
     </w:p>
     <w:p>
@@ -700,72 +570,25 @@
     </w:p>
     <w:p>
       <w:r>
-        <w:t>Reason: The role 'tablist' is missing required child roles 'tab', violating SC 1.3.1 as per axe diagnostics.</w:t>
+        <w:t>Reason: The role 'tablist' is missing required child roles 'tab' as per ARIA specifications, indicating a failure to meet SC 1.3.1.</w:t>
       </w:r>
     </w:p>
     <w:p>
       <w:r>
-        <w:t>Ref: https://dequeuniversity.com/rules/axe/4.7/aria-required-children?application=axeAPI</w:t>
+        <w:t>Ref: https://dequeuniversity.com/rules/axe/4.10/aria-required-children?application=axeAPI</w:t>
       </w:r>
     </w:p>
     <w:p>
       <w:r>
-        <w:t>Screenshot:</w:t>
+        <w:t>(No screenshot available)</w:t>
       </w:r>
-    </w:p>
-    <w:p>
-      <w:r>
-        <w:drawing>
-          <wp:inline xmlns:a="http://schemas.openxmlformats.org/drawingml/2006/main" xmlns:pic="http://schemas.openxmlformats.org/drawingml/2006/picture">
-            <wp:extent cx="3291840" cy="38056"/>
-            <wp:docPr id="6" name="Picture 6"/>
-            <wp:cNvGraphicFramePr>
-              <a:graphicFrameLocks noChangeAspect="1"/>
-            </wp:cNvGraphicFramePr>
-            <a:graphic>
-              <a:graphicData uri="http://schemas.openxmlformats.org/drawingml/2006/picture">
-                <pic:pic>
-                  <pic:nvPicPr>
-                    <pic:cNvPr id="0" name="aria-required-children___feedcontainer_.slick-dots_role_tablist_.png"/>
-                    <pic:cNvPicPr/>
-                  </pic:nvPicPr>
-                  <pic:blipFill>
-                    <a:blip r:embed="rId19"/>
-                    <a:stretch>
-                      <a:fillRect/>
-                    </a:stretch>
-                  </pic:blipFill>
-                  <pic:spPr>
-                    <a:xfrm>
-                      <a:off x="0" y="0"/>
-                      <a:ext cx="3291840" cy="38056"/>
-                    </a:xfrm>
-                    <a:prstGeom prst="rect"/>
-                  </pic:spPr>
-                </pic:pic>
-              </a:graphicData>
-            </a:graphic>
-          </wp:inline>
-        </w:drawing>
-      </w:r>
-    </w:p>
-    <w:p>
-      <w:hyperlink r:id="rId20">
-        <w:r>
-          <w:rPr>
-            <w:color w:val="1155CC"/>
-            <w:u w:val="single"/>
-          </w:rPr>
-          <w:t>Open full-size image</w:t>
-        </w:r>
-      </w:hyperlink>
     </w:p>
     <w:p>
       <w:pPr>
         <w:pStyle w:val="Heading2"/>
       </w:pPr>
       <w:r>
-        <w:t>7. SC-4.1.2 — aria-valid-attr-value</w:t>
+        <w:t>8. SC-4.1.2 — aria-valid-attr-value</w:t>
       </w:r>
     </w:p>
     <w:p>
@@ -780,72 +603,25 @@
     </w:p>
     <w:p>
       <w:r>
-        <w:t>Reason: The element has an invalid aria-describedby attribute pointing to a non-existent ID, violating SC 4.1.2. The role is correct, but the accessible name is missing.</w:t>
+        <w:t>Reason: The element has an aria-describedby attribute referencing a non-existent ID, violating SC 4.1.2. This affects the accessible name and value exposure.</w:t>
       </w:r>
     </w:p>
     <w:p>
       <w:r>
-        <w:t>Ref: https://dequeuniversity.com/rules/axe/4.7/aria-valid-attr-value?application=axeAPI</w:t>
+        <w:t>Ref: https://dequeuniversity.com/rules/axe/4.10/aria-valid-attr-value?application=axeAPI</w:t>
       </w:r>
     </w:p>
     <w:p>
       <w:r>
-        <w:t>Screenshot:</w:t>
+        <w:t>(No screenshot available)</w:t>
       </w:r>
-    </w:p>
-    <w:p>
-      <w:r>
-        <w:drawing>
-          <wp:inline xmlns:a="http://schemas.openxmlformats.org/drawingml/2006/main" xmlns:pic="http://schemas.openxmlformats.org/drawingml/2006/picture">
-            <wp:extent cx="3291840" cy="1765987"/>
-            <wp:docPr id="7" name="Picture 7"/>
-            <wp:cNvGraphicFramePr>
-              <a:graphicFrameLocks noChangeAspect="1"/>
-            </wp:cNvGraphicFramePr>
-            <a:graphic>
-              <a:graphicData uri="http://schemas.openxmlformats.org/drawingml/2006/picture">
-                <pic:pic>
-                  <pic:nvPicPr>
-                    <pic:cNvPr id="0" name="aria-valid-attr-value___slick-slide20.png"/>
-                    <pic:cNvPicPr/>
-                  </pic:nvPicPr>
-                  <pic:blipFill>
-                    <a:blip r:embed="rId21"/>
-                    <a:stretch>
-                      <a:fillRect/>
-                    </a:stretch>
-                  </pic:blipFill>
-                  <pic:spPr>
-                    <a:xfrm>
-                      <a:off x="0" y="0"/>
-                      <a:ext cx="3291840" cy="1765987"/>
-                    </a:xfrm>
-                    <a:prstGeom prst="rect"/>
-                  </pic:spPr>
-                </pic:pic>
-              </a:graphicData>
-            </a:graphic>
-          </wp:inline>
-        </w:drawing>
-      </w:r>
-    </w:p>
-    <w:p>
-      <w:hyperlink r:id="rId22">
-        <w:r>
-          <w:rPr>
-            <w:color w:val="1155CC"/>
-            <w:u w:val="single"/>
-          </w:rPr>
-          <w:t>Open full-size image</w:t>
-        </w:r>
-      </w:hyperlink>
     </w:p>
     <w:p>
       <w:pPr>
         <w:pStyle w:val="Heading2"/>
       </w:pPr>
       <w:r>
-        <w:t>8. SC-1.4.3 — color-contrast</w:t>
+        <w:t>9. SC-1.4.3 — color-contrast</w:t>
       </w:r>
     </w:p>
     <w:p>
@@ -855,77 +631,30 @@
     </w:p>
     <w:p>
       <w:r>
-        <w:t>Verdict: needs-change (confidence 0.7)</w:t>
+        <w:t>Verdict: needs-change (confidence 0.8)</w:t>
       </w:r>
     </w:p>
     <w:p>
       <w:r>
-        <w:t>Reason: Computed contrast for 'Watch Video' cannot be determined due to a pseudo element, likely failing SC 1.4.3 thresholds.</w:t>
+        <w:t>Reason: Computed contrast ratio for 'Watch Video' is likely below 4.5:1 due to undetermined background color from a pseudo element, failing SC 1.4.3.</w:t>
       </w:r>
     </w:p>
     <w:p>
       <w:r>
-        <w:t>Ref: https://dequeuniversity.com/rules/axe/4.7/color-contrast?application=axeAPI</w:t>
+        <w:t>Ref: https://dequeuniversity.com/rules/axe/4.10/color-contrast?application=axeAPI</w:t>
       </w:r>
     </w:p>
     <w:p>
       <w:r>
-        <w:t>Screenshot:</w:t>
+        <w:t>(No screenshot available)</w:t>
       </w:r>
-    </w:p>
-    <w:p>
-      <w:r>
-        <w:drawing>
-          <wp:inline xmlns:a="http://schemas.openxmlformats.org/drawingml/2006/main" xmlns:pic="http://schemas.openxmlformats.org/drawingml/2006/picture">
-            <wp:extent cx="3291840" cy="2652648"/>
-            <wp:docPr id="8" name="Picture 8"/>
-            <wp:cNvGraphicFramePr>
-              <a:graphicFrameLocks noChangeAspect="1"/>
-            </wp:cNvGraphicFramePr>
-            <a:graphic>
-              <a:graphicData uri="http://schemas.openxmlformats.org/drawingml/2006/picture">
-                <pic:pic>
-                  <pic:nvPicPr>
-                    <pic:cNvPr id="0" name="color-contrast__a_autoplay_.png"/>
-                    <pic:cNvPicPr/>
-                  </pic:nvPicPr>
-                  <pic:blipFill>
-                    <a:blip r:embed="rId23"/>
-                    <a:stretch>
-                      <a:fillRect/>
-                    </a:stretch>
-                  </pic:blipFill>
-                  <pic:spPr>
-                    <a:xfrm>
-                      <a:off x="0" y="0"/>
-                      <a:ext cx="3291840" cy="2652648"/>
-                    </a:xfrm>
-                    <a:prstGeom prst="rect"/>
-                  </pic:spPr>
-                </pic:pic>
-              </a:graphicData>
-            </a:graphic>
-          </wp:inline>
-        </w:drawing>
-      </w:r>
-    </w:p>
-    <w:p>
-      <w:hyperlink r:id="rId24">
-        <w:r>
-          <w:rPr>
-            <w:color w:val="1155CC"/>
-            <w:u w:val="single"/>
-          </w:rPr>
-          <w:t>Open full-size image</w:t>
-        </w:r>
-      </w:hyperlink>
     </w:p>
     <w:p>
       <w:pPr>
         <w:pStyle w:val="Heading2"/>
       </w:pPr>
       <w:r>
-        <w:t>9. SC-1.4.3 — color-contrast</w:t>
+        <w:t>10. SC-1.4.3 — color-contrast</w:t>
       </w:r>
     </w:p>
     <w:p>
@@ -940,72 +669,25 @@
     </w:p>
     <w:p>
       <w:r>
-        <w:t>Reason: Computed contrast ratio for the text 'Healthcare is changing.' is below the required threshold of 4.5:1 due to undetermined background color.</w:t>
+        <w:t>Reason: Computed contrast ratio for the text 'Healthcare is changing.' is below the required 4.5:1 due to undetermined background color from a pseudo element.</w:t>
       </w:r>
     </w:p>
     <w:p>
       <w:r>
-        <w:t>Ref: https://dequeuniversity.com/rules/axe/4.7/color-contrast?application=axeAPI</w:t>
+        <w:t>Ref: https://dequeuniversity.com/rules/axe/4.10/color-contrast?application=axeAPI</w:t>
       </w:r>
     </w:p>
     <w:p>
       <w:r>
-        <w:t>Screenshot:</w:t>
+        <w:t>(No screenshot available)</w:t>
       </w:r>
-    </w:p>
-    <w:p>
-      <w:r>
-        <w:drawing>
-          <wp:inline xmlns:a="http://schemas.openxmlformats.org/drawingml/2006/main" xmlns:pic="http://schemas.openxmlformats.org/drawingml/2006/picture">
-            <wp:extent cx="3291840" cy="311008"/>
-            <wp:docPr id="9" name="Picture 9"/>
-            <wp:cNvGraphicFramePr>
-              <a:graphicFrameLocks noChangeAspect="1"/>
-            </wp:cNvGraphicFramePr>
-            <a:graphic>
-              <a:graphicData uri="http://schemas.openxmlformats.org/drawingml/2006/picture">
-                <pic:pic>
-                  <pic:nvPicPr>
-                    <pic:cNvPr id="0" name="color-contrast__div_nth-child_2_p_nth-child_1_.png"/>
-                    <pic:cNvPicPr/>
-                  </pic:nvPicPr>
-                  <pic:blipFill>
-                    <a:blip r:embed="rId25"/>
-                    <a:stretch>
-                      <a:fillRect/>
-                    </a:stretch>
-                  </pic:blipFill>
-                  <pic:spPr>
-                    <a:xfrm>
-                      <a:off x="0" y="0"/>
-                      <a:ext cx="3291840" cy="311008"/>
-                    </a:xfrm>
-                    <a:prstGeom prst="rect"/>
-                  </pic:spPr>
-                </pic:pic>
-              </a:graphicData>
-            </a:graphic>
-          </wp:inline>
-        </w:drawing>
-      </w:r>
-    </w:p>
-    <w:p>
-      <w:hyperlink r:id="rId26">
-        <w:r>
-          <w:rPr>
-            <w:color w:val="1155CC"/>
-            <w:u w:val="single"/>
-          </w:rPr>
-          <w:t>Open full-size image</w:t>
-        </w:r>
-      </w:hyperlink>
     </w:p>
     <w:p>
       <w:pPr>
         <w:pStyle w:val="Heading2"/>
       </w:pPr>
       <w:r>
-        <w:t>10. SC-1.4.3 — color-contrast</w:t>
+        <w:t>11. SC-1.4.3 — color-contrast</w:t>
       </w:r>
     </w:p>
     <w:p>
@@ -1015,162 +697,449 @@
     </w:p>
     <w:p>
       <w:r>
-        <w:t>Verdict: needs-change (confidence 0.7)</w:t>
+        <w:t>Verdict: needs-change (confidence 0.8)</w:t>
       </w:r>
     </w:p>
     <w:p>
       <w:r>
-        <w:t>Reason: Computed contrast ratio for the text 'Evolve faster with Castell' is below the required threshold due to undetermined background color.</w:t>
+        <w:t>Reason: Computed contrast ratio for the text 'Evolve faster with Castell.' is below the required threshold due to undetermined background color from a pseudo element.</w:t>
       </w:r>
     </w:p>
     <w:p>
       <w:r>
-        <w:t>Ref: https://dequeuniversity.com/rules/axe/4.7/color-contrast?application=axeAPI</w:t>
+        <w:t>Ref: https://dequeuniversity.com/rules/axe/4.10/color-contrast?application=axeAPI</w:t>
       </w:r>
     </w:p>
     <w:p>
       <w:r>
-        <w:t>Screenshot:</w:t>
+        <w:t>(No screenshot available)</w:t>
       </w:r>
-    </w:p>
-    <w:p>
-      <w:r>
-        <w:drawing>
-          <wp:inline xmlns:a="http://schemas.openxmlformats.org/drawingml/2006/main" xmlns:pic="http://schemas.openxmlformats.org/drawingml/2006/picture">
-            <wp:extent cx="3291840" cy="311008"/>
-            <wp:docPr id="10" name="Picture 10"/>
-            <wp:cNvGraphicFramePr>
-              <a:graphicFrameLocks noChangeAspect="1"/>
-            </wp:cNvGraphicFramePr>
-            <a:graphic>
-              <a:graphicData uri="http://schemas.openxmlformats.org/drawingml/2006/picture">
-                <pic:pic>
-                  <pic:nvPicPr>
-                    <pic:cNvPr id="0" name="color-contrast__div_nth-child_2_p_nth-child_2_.png"/>
-                    <pic:cNvPicPr/>
-                  </pic:nvPicPr>
-                  <pic:blipFill>
-                    <a:blip r:embed="rId27"/>
-                    <a:stretch>
-                      <a:fillRect/>
-                    </a:stretch>
-                  </pic:blipFill>
-                  <pic:spPr>
-                    <a:xfrm>
-                      <a:off x="0" y="0"/>
-                      <a:ext cx="3291840" cy="311008"/>
-                    </a:xfrm>
-                    <a:prstGeom prst="rect"/>
-                  </pic:spPr>
-                </pic:pic>
-              </a:graphicData>
-            </a:graphic>
-          </wp:inline>
-        </w:drawing>
-      </w:r>
-    </w:p>
-    <w:p>
-      <w:hyperlink r:id="rId28">
-        <w:r>
-          <w:rPr>
-            <w:color w:val="1155CC"/>
-            <w:u w:val="single"/>
-          </w:rPr>
-          <w:t>Open full-size image</w:t>
-        </w:r>
-      </w:hyperlink>
     </w:p>
     <w:p>
       <w:pPr>
         <w:pStyle w:val="Heading2"/>
       </w:pPr>
       <w:r>
-        <w:t>11. SC-1.1.1 — image-alt</w:t>
+        <w:t>12. SC-1.4.3 — runner:contrast-text</w:t>
       </w:r>
     </w:p>
     <w:p>
       <w:r>
-        <w:t>Selector: img[alt="Play Button"]</w:t>
+        <w:t>Verdict: needs-change (confidence 0.9)</w:t>
       </w:r>
     </w:p>
     <w:p>
       <w:r>
-        <w:t>Verdict: redundant-ok (confidence 0.9)</w:t>
+        <w:t>Reason: Computed contrast ratio is 1.01, which is below the required 4.5:1 for normal text, indicating a failure to meet SC 1.4.3.</w:t>
       </w:r>
     </w:p>
     <w:p>
       <w:r>
-        <w:t>Reason: The alt text 'Play Button' duplicates the nearby text 'Watch Video', which already conveys the same action. No additional description is needed.</w:t>
+        <w:t>(No screenshot available)</w:t>
       </w:r>
-    </w:p>
-    <w:p>
-      <w:r>
-        <w:t>Ref: https://dequeuniversity.com/rules/axe/4.7/image-alt?application=axeAPI</w:t>
-      </w:r>
-    </w:p>
-    <w:p>
-      <w:r>
-        <w:t>Screenshot:</w:t>
-      </w:r>
-    </w:p>
-    <w:p>
-      <w:r>
-        <w:drawing>
-          <wp:inline xmlns:a="http://schemas.openxmlformats.org/drawingml/2006/main" xmlns:pic="http://schemas.openxmlformats.org/drawingml/2006/picture">
-            <wp:extent cx="3291840" cy="3291840"/>
-            <wp:docPr id="11" name="Picture 11"/>
-            <wp:cNvGraphicFramePr>
-              <a:graphicFrameLocks noChangeAspect="1"/>
-            </wp:cNvGraphicFramePr>
-            <a:graphic>
-              <a:graphicData uri="http://schemas.openxmlformats.org/drawingml/2006/picture">
-                <pic:pic>
-                  <pic:nvPicPr>
-                    <pic:cNvPr id="0" name="image-alt__img_alt_Play_Button_.png"/>
-                    <pic:cNvPicPr/>
-                  </pic:nvPicPr>
-                  <pic:blipFill>
-                    <a:blip r:embed="rId29"/>
-                    <a:stretch>
-                      <a:fillRect/>
-                    </a:stretch>
-                  </pic:blipFill>
-                  <pic:spPr>
-                    <a:xfrm>
-                      <a:off x="0" y="0"/>
-                      <a:ext cx="3291840" cy="3291840"/>
-                    </a:xfrm>
-                    <a:prstGeom prst="rect"/>
-                  </pic:spPr>
-                </pic:pic>
-              </a:graphicData>
-            </a:graphic>
-          </wp:inline>
-        </w:drawing>
-      </w:r>
-    </w:p>
-    <w:p>
-      <w:hyperlink r:id="rId30">
-        <w:r>
-          <w:rPr>
-            <w:color w:val="1155CC"/>
-            <w:u w:val="single"/>
-          </w:rPr>
-          <w:t>Open full-size image</w:t>
-        </w:r>
-      </w:hyperlink>
     </w:p>
     <w:p>
       <w:pPr>
         <w:pStyle w:val="Heading2"/>
       </w:pPr>
       <w:r>
-        <w:t>12. SC-4.1.2 — link-name</w:t>
+        <w:t>13. SC-1.4.3 — runner:contrast-text</w:t>
       </w:r>
     </w:p>
     <w:p>
       <w:r>
-        <w:t>Selector: #post-750 &gt; .text &gt; .post__link &gt; a</w:t>
+        <w:t>Verdict: needs-change (confidence 0.9)</w:t>
+      </w:r>
+    </w:p>
+    <w:p>
+      <w:r>
+        <w:t>Reason: Computed contrast ratio is 4.09, which is below the required 4.5:1 for normal text as per AXE diagnostics.</w:t>
+      </w:r>
+    </w:p>
+    <w:p>
+      <w:r>
+        <w:t>(No screenshot available)</w:t>
+      </w:r>
+    </w:p>
+    <w:p>
+      <w:pPr>
+        <w:pStyle w:val="Heading2"/>
+      </w:pPr>
+      <w:r>
+        <w:t>14. SC-1.4.3 — runner:contrast-text</w:t>
+      </w:r>
+    </w:p>
+    <w:p>
+      <w:r>
+        <w:t>Verdict: needs-change (confidence 0.9)</w:t>
+      </w:r>
+    </w:p>
+    <w:p>
+      <w:r>
+        <w:t>Reason: Computed contrast ratio is 3.96, which is below the required 4.5:1 for normal text as per AXE diagnostics.</w:t>
+      </w:r>
+    </w:p>
+    <w:p>
+      <w:r>
+        <w:t>(No screenshot available)</w:t>
+      </w:r>
+    </w:p>
+    <w:p>
+      <w:pPr>
+        <w:pStyle w:val="Heading2"/>
+      </w:pPr>
+      <w:r>
+        <w:t>15. SC-1.4.3 — runner:contrast-text</w:t>
+      </w:r>
+    </w:p>
+    <w:p>
+      <w:r>
+        <w:t>Verdict: needs-change (confidence 0.9)</w:t>
+      </w:r>
+    </w:p>
+    <w:p>
+      <w:r>
+        <w:t>Reason: Computed contrast ratio is 3.96, which is below the required 4.5:1 for normal text as per AXE diagnostics.</w:t>
+      </w:r>
+    </w:p>
+    <w:p>
+      <w:r>
+        <w:t>(No screenshot available)</w:t>
+      </w:r>
+    </w:p>
+    <w:p>
+      <w:pPr>
+        <w:pStyle w:val="Heading2"/>
+      </w:pPr>
+      <w:r>
+        <w:t>16. SC-1.4.3 — runner:contrast-text</w:t>
+      </w:r>
+    </w:p>
+    <w:p>
+      <w:r>
+        <w:t>Verdict: needs-change (confidence 0.9)</w:t>
+      </w:r>
+    </w:p>
+    <w:p>
+      <w:r>
+        <w:t>Reason: Computed contrast ratio is 1.01, which is below the required 4.5:1 for normal text, indicating a failure to meet SC 1.4.3.</w:t>
+      </w:r>
+    </w:p>
+    <w:p>
+      <w:r>
+        <w:t>(No screenshot available)</w:t>
+      </w:r>
+    </w:p>
+    <w:p>
+      <w:pPr>
+        <w:pStyle w:val="Heading2"/>
+      </w:pPr>
+      <w:r>
+        <w:t>17. SC-1.4.3 — runner:contrast-text</w:t>
+      </w:r>
+    </w:p>
+    <w:p>
+      <w:r>
+        <w:t>Verdict: needs-change (confidence 0.9)</w:t>
+      </w:r>
+    </w:p>
+    <w:p>
+      <w:r>
+        <w:t>Reason: Computed contrast ratio is 2.18, which is below the required 3.0 for large text, indicating insufficient contrast against the background.</w:t>
+      </w:r>
+    </w:p>
+    <w:p>
+      <w:r>
+        <w:t>(No screenshot available)</w:t>
+      </w:r>
+    </w:p>
+    <w:p>
+      <w:pPr>
+        <w:pStyle w:val="Heading2"/>
+      </w:pPr>
+      <w:r>
+        <w:t>18. SC-1.4.3 — runner:contrast-text</w:t>
+      </w:r>
+    </w:p>
+    <w:p>
+      <w:r>
+        <w:t>Verdict: needs-change (confidence 0.9)</w:t>
+      </w:r>
+    </w:p>
+    <w:p>
+      <w:r>
+        <w:t>Reason: Computed contrast ratio is 2.04, which is below the required 4.5:1 for normal text, indicating insufficient contrast.</w:t>
+      </w:r>
+    </w:p>
+    <w:p>
+      <w:r>
+        <w:t>(No screenshot available)</w:t>
+      </w:r>
+    </w:p>
+    <w:p>
+      <w:pPr>
+        <w:pStyle w:val="Heading2"/>
+      </w:pPr>
+      <w:r>
+        <w:t>19. SC-1.4.3 — runner:contrast-text</w:t>
+      </w:r>
+    </w:p>
+    <w:p>
+      <w:r>
+        <w:t>Verdict: needs-change (confidence 0.9)</w:t>
+      </w:r>
+    </w:p>
+    <w:p>
+      <w:r>
+        <w:t>Reason: Computed contrast ratio is 3.64, which is below the required 4.5:1 for normal text, indicating a failure to meet SC 1.4.3.</w:t>
+      </w:r>
+    </w:p>
+    <w:p>
+      <w:r>
+        <w:t>(No screenshot available)</w:t>
+      </w:r>
+    </w:p>
+    <w:p>
+      <w:pPr>
+        <w:pStyle w:val="Heading2"/>
+      </w:pPr>
+      <w:r>
+        <w:t>20. SC-1.4.3 — runner:contrast-text</w:t>
+      </w:r>
+    </w:p>
+    <w:p>
+      <w:r>
+        <w:t>Verdict: needs-change (confidence 0.9)</w:t>
+      </w:r>
+    </w:p>
+    <w:p>
+      <w:r>
+        <w:t>Reason: Computed contrast ratio is 3.64, which is below the required 4.5:1 for normal text, indicating a failure to meet SC 1.4.3.</w:t>
+      </w:r>
+    </w:p>
+    <w:p>
+      <w:r>
+        <w:t>(No screenshot available)</w:t>
+      </w:r>
+    </w:p>
+    <w:p>
+      <w:pPr>
+        <w:pStyle w:val="Heading2"/>
+      </w:pPr>
+      <w:r>
+        <w:t>21. SC-1.4.3 — runner:contrast-text</w:t>
+      </w:r>
+    </w:p>
+    <w:p>
+      <w:r>
+        <w:t>Verdict: needs-change (confidence 0.9)</w:t>
+      </w:r>
+    </w:p>
+    <w:p>
+      <w:r>
+        <w:t>Reason: Computed contrast ratio of 2.54 is below the required 4.5:1 for normal text, indicating insufficient contrast against the background.</w:t>
+      </w:r>
+    </w:p>
+    <w:p>
+      <w:r>
+        <w:t>(No screenshot available)</w:t>
+      </w:r>
+    </w:p>
+    <w:p>
+      <w:pPr>
+        <w:pStyle w:val="Heading2"/>
+      </w:pPr>
+      <w:r>
+        <w:t>22. SC-1.4.3 — runner:contrast-text</w:t>
+      </w:r>
+    </w:p>
+    <w:p>
+      <w:r>
+        <w:t>Verdict: needs-change (confidence 0.9)</w:t>
+      </w:r>
+    </w:p>
+    <w:p>
+      <w:r>
+        <w:t>Reason: Computed contrast ratio is 2.54, which is below the required 4.5:1 for normal text, indicating a failure to meet SC 1.4.3.</w:t>
+      </w:r>
+    </w:p>
+    <w:p>
+      <w:r>
+        <w:t>(No screenshot available)</w:t>
+      </w:r>
+    </w:p>
+    <w:p>
+      <w:pPr>
+        <w:pStyle w:val="Heading2"/>
+      </w:pPr>
+      <w:r>
+        <w:t>23. SC-1.4.3 — runner:contrast-text</w:t>
+      </w:r>
+    </w:p>
+    <w:p>
+      <w:r>
+        <w:t>Verdict: needs-change (confidence 0.9)</w:t>
+      </w:r>
+    </w:p>
+    <w:p>
+      <w:r>
+        <w:t>Reason: Computed contrast ratio is 3.64, which is below the required 4.5:1 for normal text, indicating a failure to meet SC 1.4.3.</w:t>
+      </w:r>
+    </w:p>
+    <w:p>
+      <w:r>
+        <w:t>(No screenshot available)</w:t>
+      </w:r>
+    </w:p>
+    <w:p>
+      <w:pPr>
+        <w:pStyle w:val="Heading2"/>
+      </w:pPr>
+      <w:r>
+        <w:t>24. SC-1.4.3 — runner:contrast-text</w:t>
+      </w:r>
+    </w:p>
+    <w:p>
+      <w:r>
+        <w:t>Verdict: needs-change (confidence 0.9)</w:t>
+      </w:r>
+    </w:p>
+    <w:p>
+      <w:r>
+        <w:t>Reason: Computed contrast ratio is 3.64, which is below the required 4.5:1 for normal text, indicating a failure to meet SC 1.4.3.</w:t>
+      </w:r>
+    </w:p>
+    <w:p>
+      <w:r>
+        <w:t>(No screenshot available)</w:t>
+      </w:r>
+    </w:p>
+    <w:p>
+      <w:pPr>
+        <w:pStyle w:val="Heading2"/>
+      </w:pPr>
+      <w:r>
+        <w:t>25. SC-1.4.3 — runner:contrast-text</w:t>
+      </w:r>
+    </w:p>
+    <w:p>
+      <w:r>
+        <w:t>Verdict: needs-change (confidence 0.9)</w:t>
+      </w:r>
+    </w:p>
+    <w:p>
+      <w:r>
+        <w:t>Reason: Computed contrast ratio is 3.64, which is below the required 4.5:1 for normal text, indicating a failure to meet SC 1.4.3.</w:t>
+      </w:r>
+    </w:p>
+    <w:p>
+      <w:r>
+        <w:t>(No screenshot available)</w:t>
+      </w:r>
+    </w:p>
+    <w:p>
+      <w:pPr>
+        <w:pStyle w:val="Heading2"/>
+      </w:pPr>
+      <w:r>
+        <w:t>26. SC-1.4.3 — runner:contrast-text</w:t>
+      </w:r>
+    </w:p>
+    <w:p>
+      <w:r>
+        <w:t>Verdict: needs-change (confidence 0.9)</w:t>
+      </w:r>
+    </w:p>
+    <w:p>
+      <w:r>
+        <w:t>Reason: Computed contrast ratio is 3.64, which is below the required 4.5:1 for normal text, indicating a failure to meet SC 1.4.3.</w:t>
+      </w:r>
+    </w:p>
+    <w:p>
+      <w:r>
+        <w:t>(No screenshot available)</w:t>
+      </w:r>
+    </w:p>
+    <w:p>
+      <w:pPr>
+        <w:pStyle w:val="Heading2"/>
+      </w:pPr>
+      <w:r>
+        <w:t>27. SC-1.4.3 — runner:contrast-text</w:t>
+      </w:r>
+    </w:p>
+    <w:p>
+      <w:r>
+        <w:t>Verdict: needs-change (confidence 0.9)</w:t>
+      </w:r>
+    </w:p>
+    <w:p>
+      <w:r>
+        <w:t>Reason: Computed contrast ratio is 3.64, which is below the required 4.5:1 for normal text, indicating a failure to meet SC 1.4.3.</w:t>
+      </w:r>
+    </w:p>
+    <w:p>
+      <w:r>
+        <w:t>(No screenshot available)</w:t>
+      </w:r>
+    </w:p>
+    <w:p>
+      <w:pPr>
+        <w:pStyle w:val="Heading2"/>
+      </w:pPr>
+      <w:r>
+        <w:t>28. SC-1.4.3 — runner:contrast-text</w:t>
+      </w:r>
+    </w:p>
+    <w:p>
+      <w:r>
+        <w:t>Verdict: needs-change (confidence 0.9)</w:t>
+      </w:r>
+    </w:p>
+    <w:p>
+      <w:r>
+        <w:t>Reason: Computed contrast ratio is 3.64, which is below the required 4.5:1 for normal text, indicating a failure to meet SC 1.4.3.</w:t>
+      </w:r>
+    </w:p>
+    <w:p>
+      <w:r>
+        <w:t>(No screenshot available)</w:t>
+      </w:r>
+    </w:p>
+    <w:p>
+      <w:pPr>
+        <w:pStyle w:val="Heading2"/>
+      </w:pPr>
+      <w:r>
+        <w:t>29. SC-1.4.3 — runner:contrast-text</w:t>
+      </w:r>
+    </w:p>
+    <w:p>
+      <w:r>
+        <w:t>Verdict: needs-change (confidence 0.9)</w:t>
+      </w:r>
+    </w:p>
+    <w:p>
+      <w:r>
+        <w:t>Reason: Computed contrast ratio is 3.64, which is below the required 4.5:1 for normal text, indicating a failure to meet SC 1.4.3.</w:t>
+      </w:r>
+    </w:p>
+    <w:p>
+      <w:r>
+        <w:t>(No screenshot available)</w:t>
+      </w:r>
+    </w:p>
+    <w:p>
+      <w:pPr>
+        <w:pStyle w:val="Heading2"/>
+      </w:pPr>
+      <w:r>
+        <w:t>30. SC-2.4.6 — runner:ai-2.4.6-local</w:t>
+      </w:r>
+    </w:p>
+    <w:p>
+      <w:r>
+        <w:t>Selector: a</w:t>
       </w:r>
     </w:p>
     <w:p>
@@ -1180,70 +1149,20 @@
     </w:p>
     <w:p>
       <w:r>
-        <w:t>Reason: The link text 'READ MORE' lacks sufficient context to convey its purpose, failing SC 2.4.4. The title attribute provides additional information but does not replace the need for a meaningful link name.</w:t>
+        <w:t>Reason: The link uses a generic label with no descriptive context, failing to convey its purpose. AXE diagnostics indicate the label is too short and generic.</w:t>
       </w:r>
     </w:p>
     <w:p>
       <w:r>
-        <w:t>Ref: https://dequeuniversity.com/rules/axe/4.7/link-name?application=axeAPI</w:t>
+        <w:t>(No screenshot available)</w:t>
       </w:r>
     </w:p>
     <w:p>
+      <w:pPr>
+        <w:pStyle w:val="Heading1"/>
+      </w:pPr>
       <w:r>
-        <w:t>Screenshot:</w:t>
-      </w:r>
-    </w:p>
-    <w:p>
-      <w:r>
-        <w:drawing>
-          <wp:inline xmlns:a="http://schemas.openxmlformats.org/drawingml/2006/main" xmlns:pic="http://schemas.openxmlformats.org/drawingml/2006/picture">
-            <wp:extent cx="3291840" cy="556054"/>
-            <wp:docPr id="12" name="Picture 12"/>
-            <wp:cNvGraphicFramePr>
-              <a:graphicFrameLocks noChangeAspect="1"/>
-            </wp:cNvGraphicFramePr>
-            <a:graphic>
-              <a:graphicData uri="http://schemas.openxmlformats.org/drawingml/2006/picture">
-                <pic:pic>
-                  <pic:nvPicPr>
-                    <pic:cNvPr id="0" name="link-name___post-750_.text_.post__link_a.png"/>
-                    <pic:cNvPicPr/>
-                  </pic:nvPicPr>
-                  <pic:blipFill>
-                    <a:blip r:embed="rId31"/>
-                    <a:stretch>
-                      <a:fillRect/>
-                    </a:stretch>
-                  </pic:blipFill>
-                  <pic:spPr>
-                    <a:xfrm>
-                      <a:off x="0" y="0"/>
-                      <a:ext cx="3291840" cy="556054"/>
-                    </a:xfrm>
-                    <a:prstGeom prst="rect"/>
-                  </pic:spPr>
-                </pic:pic>
-              </a:graphicData>
-            </a:graphic>
-          </wp:inline>
-        </w:drawing>
-      </w:r>
-    </w:p>
-    <w:p>
-      <w:hyperlink r:id="rId32">
-        <w:r>
-          <w:rPr>
-            <w:color w:val="1155CC"/>
-            <w:u w:val="single"/>
-          </w:rPr>
-          <w:t>Open full-size image</w:t>
-        </w:r>
-      </w:hyperlink>
-    </w:p>
-    <w:p>
-      <w:r>
-        <w:br/>
-        <w:t>Embedded screenshots: 12 of 12</w:t>
+        <w:t>Keyboard Probe — Detailed Findings</w:t>
       </w:r>
     </w:p>
     <w:sectPr>

</xml_diff>